<commit_message>
Doku: Sandwich-Aufbau mit 3D-Ansichten und Fotos
Der echte Aufbau (Martin, laeuft) ist ein Sandwich: MAX98357A Ruecken an
Ruecken auf dem ESP32-S3-Zero, kein Lochraster. README, Hardware-Bauplan
und Projektbeschreibung darauf umgestellt, 3D-Ansichten und Fotos ergaenzt,
Port-A-Kabelfarben festgelegt (schwarz, rot, gelb IO5, weiss IO6), Port C
optional. Alte WLAN-Bruecke an IO9 aus Bild 'MAX direkt' entfernt.

Co-Authored-By: Claude Opus 5.5 <noreply@anthropic.com>
Claude-Session: https://claude.ai/code/session_0118D4qqy4wNMTv6qeK7BG5d
</commit_message>
<xml_diff>
--- a/docs/Hardware-Bauplan_Mini-S3.docx
+++ b/docs/Hardware-Bauplan_Mini-S3.docx
@@ -43,7 +43,7 @@
           <w:sz w:val="20"/>
           <w:szCs w:val="20"/>
         </w:rPr>
-        <w:t>Waveshare ESP32-S3-Zero · ESP32-S3FH4R2 (4 MB Flash, 2 MB PSRAM) · Stand 26.10.2026 (Firmware v0.05) · Entwurf</w:t>
+        <w:t>Waveshare ESP32-S3-Zero · ESP32-S3FH4R2 (4 MB Flash, 2 MB PSRAM) · Stand 27.10.2026 (Firmware v0.06) · Aufbau nach Martins Muster</w:t>
       </w:r>
     </w:p>
     <w:tbl>
@@ -101,7 +101,7 @@
                 <w:sz w:val="21"/>
                 <w:szCs w:val="21"/>
               </w:rPr>
-              <w:t xml:space="preserve">Die Pinbelegung steht in der Firmware (firmware/src/pins.h) und ist so gewählt, dass der MAX98357A direkt auf der Versorgungsreihe des S3-Zero sitzt. Die Reihenfolge der Header-Pins stammt aus dem Footprint im Repo RC-Multiswitch-ESP32-S3 (laut Waveshare-Pinout). Einen KiCad-Schaltplan für das Mini gibt es noch nicht; die Grafiken sind aus pins.h gezeichnet. Die SD-Karte ist in diesem Aufbau nicht vorgesehen, die Sounds liegen im Flash.</w:t>
+              <w:t xml:space="preserve">Die Pinbelegung steht in der Firmware (firmware/ESP32_Sound_Mini_S3/pins.h) und ist so gewählt, dass der MAX98357A direkt auf der Versorgungsreihe des S3-Zero sitzt. Die Reihenfolge der Header-Pins stammt aus dem Footprint im Repo RC-Multiswitch-ESP32-S3 (laut Waveshare-Pinout). Einen KiCad-Schaltplan für das Mini gibt es noch nicht; die Grafiken sind aus pins.h gezeichnet. Die SD-Karte ist in diesem Aufbau nicht vorgesehen, die Sounds liegen im Flash.</w:t>
             </w:r>
           </w:p>
         </w:tc>
@@ -473,7 +473,7 @@
                 <w:sz w:val="19"/>
                 <w:szCs w:val="19"/>
               </w:rPr>
-              <w:t xml:space="preserve">1</w:t>
+              <w:t>1</w:t>
             </w:r>
           </w:p>
         </w:tc>
@@ -504,7 +504,7 @@
                 <w:sz w:val="19"/>
                 <w:szCs w:val="19"/>
               </w:rPr>
-              <w:t xml:space="preserve">MAX98357A-Breakout (I2S, mono)</w:t>
+              <w:t>MAX98357A-Breakout (I2S, mono)</w:t>
             </w:r>
           </w:p>
         </w:tc>
@@ -535,7 +535,7 @@
                 <w:sz w:val="19"/>
                 <w:szCs w:val="19"/>
               </w:rPr>
-              <w:t xml:space="preserve">Pinreihe LRC, BCLK, DIN, GAIN, SD, GND, VIN (Adafruit-Layout)</w:t>
+              <w:t>Pinreihe LRC, BCLK, DIN, GAIN, SD, GND, VIN; sitzt Rücken an Rücken auf dem ESP</w:t>
             </w:r>
           </w:p>
         </w:tc>
@@ -660,7 +660,7 @@
                 <w:sz w:val="19"/>
                 <w:szCs w:val="19"/>
               </w:rPr>
-              <w:t xml:space="preserve">1</w:t>
+              <w:t>1</w:t>
             </w:r>
           </w:p>
         </w:tc>
@@ -691,7 +691,7 @@
                 <w:sz w:val="19"/>
                 <w:szCs w:val="19"/>
               </w:rPr>
-              <w:t xml:space="preserve">Stiftleiste 4-polig (oder JST-Buchse)</w:t>
+              <w:t>Kabel 4-adrig mit JST-Stecker 4-polig</w:t>
             </w:r>
           </w:p>
         </w:tc>
@@ -722,7 +722,7 @@
                 <w:sz w:val="19"/>
                 <w:szCs w:val="19"/>
               </w:rPr>
-              <w:t xml:space="preserve">Port A (Empfänger)</w:t>
+              <w:t>Port A zum Empfänger: schwarz GND, rot +5V, gelb IO5, weiß IO6</w:t>
             </w:r>
           </w:p>
         </w:tc>
@@ -754,7 +754,7 @@
                 <w:sz w:val="19"/>
                 <w:szCs w:val="19"/>
               </w:rPr>
-              <w:t xml:space="preserve">2</w:t>
+              <w:t>2</w:t>
             </w:r>
           </w:p>
         </w:tc>
@@ -784,7 +784,7 @@
                 <w:sz w:val="19"/>
                 <w:szCs w:val="19"/>
               </w:rPr>
-              <w:t xml:space="preserve">Stiftleiste 2-polig</w:t>
+              <w:t>Stiftleiste 2-polig</w:t>
             </w:r>
           </w:p>
         </w:tc>
@@ -814,7 +814,7 @@
                 <w:sz w:val="19"/>
                 <w:szCs w:val="19"/>
               </w:rPr>
-              <w:t xml:space="preserve">Port B und Port C (RX, TX)</w:t>
+              <w:t>Port B (IO7 RX, IO8 TX) und IO5/IO6 für die Port-A-Kabel; Port C bei Bedarf als Kabel direkt an IO43/IO44</w:t>
             </w:r>
           </w:p>
         </w:tc>
@@ -847,7 +847,7 @@
                 <w:sz w:val="19"/>
                 <w:szCs w:val="19"/>
               </w:rPr>
-              <w:t xml:space="preserve">1</w:t>
+              <w:t>1</w:t>
             </w:r>
           </w:p>
         </w:tc>
@@ -878,7 +878,7 @@
                 <w:sz w:val="19"/>
                 <w:szCs w:val="19"/>
               </w:rPr>
-              <w:t xml:space="preserve">Stiftleiste 7-polig</w:t>
+              <w:t>Stiftleiste 7-polig</w:t>
             </w:r>
           </w:p>
         </w:tc>
@@ -909,7 +909,7 @@
                 <w:sz w:val="19"/>
                 <w:szCs w:val="19"/>
               </w:rPr>
-              <w:t xml:space="preserve">MAX98357A auf den ESP (liegt dem MAX meist bei)</w:t>
+              <w:t>MAX98357A auf den ESP (liegt dem MAX meist bei), SD-Stift entfernen</w:t>
             </w:r>
           </w:p>
         </w:tc>
@@ -941,7 +941,7 @@
                 <w:sz w:val="19"/>
                 <w:szCs w:val="19"/>
               </w:rPr>
-              <w:t xml:space="preserve">1</w:t>
+              <w:t>1</w:t>
             </w:r>
           </w:p>
         </w:tc>
@@ -971,7 +971,7 @@
                 <w:sz w:val="19"/>
                 <w:szCs w:val="19"/>
               </w:rPr>
-              <w:t xml:space="preserve">Stiftleiste 2-polig / Schraubklemme</w:t>
+              <w:t>JST-PH-Buchse 2-polig</w:t>
             </w:r>
           </w:p>
         </w:tc>
@@ -1001,194 +1001,7 @@
                 <w:sz w:val="19"/>
                 <w:szCs w:val="19"/>
               </w:rPr>
-              <w:t xml:space="preserve">Lautsprecher</w:t>
-            </w:r>
-          </w:p>
-        </w:tc>
-      </w:tr>
-      <w:tr>
-        <w:tc>
-          <w:tcPr>
-            <w:tcW w:type="dxa" w:w="900"/>
-            <w:tcBorders>
-              <w:top w:val="single" w:color="CBD5E1" w:sz="4"/>
-              <w:left w:val="single" w:color="CBD5E1" w:sz="4"/>
-              <w:bottom w:val="single" w:color="CBD5E1" w:sz="4"/>
-              <w:right w:val="single" w:color="CBD5E1" w:sz="4"/>
-            </w:tcBorders>
-            <w:tcMar>
-              <w:top w:type="dxa" w:w="60"/>
-              <w:left w:type="dxa" w:w="100"/>
-              <w:bottom w:type="dxa" w:w="60"/>
-              <w:right w:type="dxa" w:w="100"/>
-            </w:tcMar>
-          </w:tcPr>
-          <w:p>
-            <w:r>
-              <w:rPr>
-                <w:rFonts w:ascii="Arial" w:cs="Arial" w:eastAsia="Arial" w:hAnsi="Arial"/>
-                <w:b w:val="false"/>
-                <w:bCs w:val="false"/>
-                <w:color w:val="0F172A"/>
-                <w:sz w:val="19"/>
-                <w:szCs w:val="19"/>
-              </w:rPr>
-              <w:t xml:space="preserve">2</w:t>
-            </w:r>
-          </w:p>
-        </w:tc>
-        <w:tc>
-          <w:tcPr>
-            <w:tcW w:type="dxa" w:w="3900"/>
-            <w:tcBorders>
-              <w:top w:val="single" w:color="CBD5E1" w:sz="4"/>
-              <w:left w:val="single" w:color="CBD5E1" w:sz="4"/>
-              <w:bottom w:val="single" w:color="CBD5E1" w:sz="4"/>
-              <w:right w:val="single" w:color="CBD5E1" w:sz="4"/>
-            </w:tcBorders>
-            <w:tcMar>
-              <w:top w:type="dxa" w:w="60"/>
-              <w:left w:type="dxa" w:w="100"/>
-              <w:bottom w:type="dxa" w:w="60"/>
-              <w:right w:type="dxa" w:w="100"/>
-            </w:tcMar>
-          </w:tcPr>
-          <w:p>
-            <w:r>
-              <w:rPr>
-                <w:rFonts w:ascii="Arial" w:cs="Arial" w:eastAsia="Arial" w:hAnsi="Arial"/>
-                <w:b w:val="false"/>
-                <w:bCs w:val="false"/>
-                <w:color w:val="0F172A"/>
-                <w:sz w:val="19"/>
-                <w:szCs w:val="19"/>
-              </w:rPr>
-              <w:t xml:space="preserve">Buchsenleiste passend zum ESP-Board</w:t>
-            </w:r>
-          </w:p>
-        </w:tc>
-        <w:tc>
-          <w:tcPr>
-            <w:tcW w:type="dxa" w:w="4226"/>
-            <w:tcBorders>
-              <w:top w:val="single" w:color="CBD5E1" w:sz="4"/>
-              <w:left w:val="single" w:color="CBD5E1" w:sz="4"/>
-              <w:bottom w:val="single" w:color="CBD5E1" w:sz="4"/>
-              <w:right w:val="single" w:color="CBD5E1" w:sz="4"/>
-            </w:tcBorders>
-            <w:tcMar>
-              <w:top w:type="dxa" w:w="60"/>
-              <w:left w:type="dxa" w:w="100"/>
-              <w:bottom w:type="dxa" w:w="60"/>
-              <w:right w:type="dxa" w:w="100"/>
-            </w:tcMar>
-          </w:tcPr>
-          <w:p>
-            <w:r>
-              <w:rPr>
-                <w:rFonts w:ascii="Arial" w:cs="Arial" w:eastAsia="Arial" w:hAnsi="Arial"/>
-                <w:b w:val="false"/>
-                <w:bCs w:val="false"/>
-                <w:color w:val="0F172A"/>
-                <w:sz w:val="19"/>
-                <w:szCs w:val="19"/>
-              </w:rPr>
-              <w:t xml:space="preserve">ESP steckbar statt fest gelötet</w:t>
-            </w:r>
-          </w:p>
-        </w:tc>
-      </w:tr>
-      <w:tr>
-        <w:tc>
-          <w:tcPr>
-            <w:tcW w:type="dxa" w:w="900"/>
-            <w:tcBorders>
-              <w:top w:val="single" w:color="CBD5E1" w:sz="4"/>
-              <w:left w:val="single" w:color="CBD5E1" w:sz="4"/>
-              <w:bottom w:val="single" w:color="CBD5E1" w:sz="4"/>
-              <w:right w:val="single" w:color="CBD5E1" w:sz="4"/>
-            </w:tcBorders>
-            <w:shd w:fill="F1F5F9" w:color="auto" w:val="clear"/>
-            <w:tcMar>
-              <w:top w:type="dxa" w:w="60"/>
-              <w:left w:type="dxa" w:w="100"/>
-              <w:bottom w:type="dxa" w:w="60"/>
-              <w:right w:type="dxa" w:w="100"/>
-            </w:tcMar>
-          </w:tcPr>
-          <w:p>
-            <w:r>
-              <w:rPr>
-                <w:rFonts w:ascii="Arial" w:cs="Arial" w:eastAsia="Arial" w:hAnsi="Arial"/>
-                <w:b w:val="false"/>
-                <w:bCs w:val="false"/>
-                <w:color w:val="0F172A"/>
-                <w:sz w:val="19"/>
-                <w:szCs w:val="19"/>
-              </w:rPr>
-              <w:t xml:space="preserve">1</w:t>
-            </w:r>
-          </w:p>
-        </w:tc>
-        <w:tc>
-          <w:tcPr>
-            <w:tcW w:type="dxa" w:w="3900"/>
-            <w:tcBorders>
-              <w:top w:val="single" w:color="CBD5E1" w:sz="4"/>
-              <w:left w:val="single" w:color="CBD5E1" w:sz="4"/>
-              <w:bottom w:val="single" w:color="CBD5E1" w:sz="4"/>
-              <w:right w:val="single" w:color="CBD5E1" w:sz="4"/>
-            </w:tcBorders>
-            <w:shd w:fill="F1F5F9" w:color="auto" w:val="clear"/>
-            <w:tcMar>
-              <w:top w:type="dxa" w:w="60"/>
-              <w:left w:type="dxa" w:w="100"/>
-              <w:bottom w:type="dxa" w:w="60"/>
-              <w:right w:type="dxa" w:w="100"/>
-            </w:tcMar>
-          </w:tcPr>
-          <w:p>
-            <w:r>
-              <w:rPr>
-                <w:rFonts w:ascii="Arial" w:cs="Arial" w:eastAsia="Arial" w:hAnsi="Arial"/>
-                <w:b w:val="false"/>
-                <w:bCs w:val="false"/>
-                <w:color w:val="0F172A"/>
-                <w:sz w:val="19"/>
-                <w:szCs w:val="19"/>
-              </w:rPr>
-              <w:t xml:space="preserve">Lochrasterplatine ca. 5 × 7 cm</w:t>
-            </w:r>
-          </w:p>
-        </w:tc>
-        <w:tc>
-          <w:tcPr>
-            <w:tcW w:type="dxa" w:w="4226"/>
-            <w:tcBorders>
-              <w:top w:val="single" w:color="CBD5E1" w:sz="4"/>
-              <w:left w:val="single" w:color="CBD5E1" w:sz="4"/>
-              <w:bottom w:val="single" w:color="CBD5E1" w:sz="4"/>
-              <w:right w:val="single" w:color="CBD5E1" w:sz="4"/>
-            </w:tcBorders>
-            <w:shd w:fill="F1F5F9" w:color="auto" w:val="clear"/>
-            <w:tcMar>
-              <w:top w:type="dxa" w:w="60"/>
-              <w:left w:type="dxa" w:w="100"/>
-              <w:bottom w:type="dxa" w:w="60"/>
-              <w:right w:type="dxa" w:w="100"/>
-            </w:tcMar>
-          </w:tcPr>
-          <w:p>
-            <w:r>
-              <w:rPr>
-                <w:rFonts w:ascii="Arial" w:cs="Arial" w:eastAsia="Arial" w:hAnsi="Arial"/>
-                <w:b w:val="false"/>
-                <w:bCs w:val="false"/>
-                <w:color w:val="0F172A"/>
-                <w:sz w:val="19"/>
-                <w:szCs w:val="19"/>
-              </w:rPr>
-              <w:t xml:space="preserve">oder eigene Platine</w:t>
+              <w:t>Lautsprecher am MAX (+ und −)</w:t>
             </w:r>
           </w:p>
         </w:tc>
@@ -3648,7 +3461,7 @@
                 <w:sz w:val="19"/>
                 <w:szCs w:val="19"/>
               </w:rPr>
-              <w:t xml:space="preserve"/>
+              <w:t>optional, Kabel direkt anlöten</w:t>
             </w:r>
           </w:p>
         </w:tc>
@@ -3800,7 +3613,7 @@
                 <w:sz w:val="19"/>
                 <w:szCs w:val="19"/>
               </w:rPr>
-              <w:t xml:space="preserve"/>
+              <w:t>optional, Kabel direkt anlöten</w:t>
             </w:r>
           </w:p>
         </w:tc>
@@ -4040,7 +3853,7 @@
           <w:sz w:val="22"/>
           <w:szCs w:val="22"/>
         </w:rPr>
-        <w:t xml:space="preserve">Der MAX98357A wird ohne Kabel direkt auf die Versorgungsreihe des Waveshare ESP32-S3-Zero gelötet. Die 7 Pins des MAX (LRC, BCLK, DIN, GAIN, SD, GND, VIN) treffen dabei in umgekehrter Reihenfolge genau auf 5V, GND, 3V3, IO1, IO2, IO3, IO4. VIN muss auf 5V liegen, GND auf GND. Der SD-Pin wird nicht angelötet.</w:t>
+        <w:t>Der MAX98357A wird ohne Kabel direkt auf die Versorgungsreihe des Waveshare ESP32-S3-Zero gelötet. Die 7 Pins des MAX (LRC, BCLK, DIN, GAIN, SD, GND, VIN) treffen dabei in umgekehrter Reihenfolge genau auf 5V, GND, 3V3, IO1, IO2, IO3, IO4. VIN muss auf 5V liegen, GND auf GND. Der SD-Pin wird nicht angelötet. Er sitzt Rücken an Rücken auf der Rückseite des ESP, die Bauteilseite des ESP mit USB-C und BOOT-Taste bleibt frei (Bild 5 und 6).</w:t>
       </w:r>
     </w:p>
     <w:p>
@@ -4175,7 +3988,7 @@
           <w:sz w:val="22"/>
           <w:szCs w:val="22"/>
         </w:rPr>
-        <w:t xml:space="preserve">Port A holt +5V und GND an denselben Lötstellen ab, am einfachsten über die VIN- und GND-Pins des MAX.</w:t>
+        <w:t>Port A holt +5V und GND an denselben Pins ab: Die Kabel werden auf der Bauteilseite des ESP an 5V und GND gelötet.</w:t>
       </w:r>
     </w:p>
     <w:p>
@@ -4200,7 +4013,7 @@
           <w:sz w:val="22"/>
           <w:szCs w:val="22"/>
         </w:rPr>
-        <w:t xml:space="preserve">Port A hat 4 Pins wie der Empfängerstecker. Port B und Port C haben nur RX und TX. Wichtig ist, dass TX des Geräts an RX des ESP geht und umgekehrt.</w:t>
+        <w:t>Port A hat 4 Pins wie der Empfängerstecker. Port B und Port C haben nur RX und TX. Wichtig ist, dass TX des Geräts an RX des ESP geht und umgekehrt. Im Musteraufbau ist Port A ein 4-adriges Kabel mit JST-Stecker, Port B eine 2-polige Stiftleiste, Port C ist optional.</w:t>
       </w:r>
     </w:p>
     <w:p>
@@ -4370,9 +4183,9 @@
       <w:r>
         <w:drawing>
           <wp:inline distT="0" distB="0" distL="0" distR="0">
-            <wp:extent cx="5715000" cy="3333750"/>
+            <wp:extent cx="5715000" cy="3577166"/>
             <wp:effectExtent t="0" r="0" b="0" l="0"/>
-            <wp:docPr id="1" name="aufbau_S3.png" descr="Bild 5: Anordnungsvorschlag auf Lochraster (Mini S3)" title="Bild 5: Anordnungsvorschlag auf Lochraster (Mini S3)"/>
+            <wp:docPr id="1" name="aufbau3d_max_S3.png" descr="Bild 5: Aufbau als Sandwich, MAX-Seite" title="Bild 5: Aufbau als Sandwich, MAX-Seite"/>
             <wp:cNvGraphicFramePr>
               <a:graphicFrameLocks xmlns:a="http://schemas.openxmlformats.org/drawingml/2006/main" noChangeAspect="1"/>
             </wp:cNvGraphicFramePr>
@@ -4395,7 +4208,7 @@
                   <pic:spPr bwMode="auto">
                     <a:xfrm>
                       <a:off x="0" y="0"/>
-                      <a:ext cx="5715000" cy="3333750"/>
+                      <a:ext cx="5715000" cy="3577166"/>
                     </a:xfrm>
                     <a:prstGeom prst="rect">
                       <a:avLst/>
@@ -4422,7 +4235,158 @@
           <w:sz w:val="18"/>
           <w:szCs w:val="18"/>
         </w:rPr>
-        <w:t xml:space="preserve">Bild 5: Anordnungsvorschlag auf Lochraster (Mini S3)</w:t>
+        <w:t>Bild 5: Aufbau als Sandwich, MAX-Seite (3D-Ansicht)</w:t>
+      </w:r>
+    </w:p>
+    <w:p>
+      <w:pPr>
+        <w:spacing w:after="60" w:before="120"/>
+        <w:jc w:val="center"/>
+      </w:pPr>
+      <w:r>
+        <w:drawing>
+          <wp:inline xmlns:a="http://schemas.openxmlformats.org/drawingml/2006/main" xmlns:pic="http://schemas.openxmlformats.org/drawingml/2006/picture">
+            <wp:extent cx="5715000" cy="3577167"/>
+            <wp:docPr id="2" name="Picture 2"/>
+            <wp:cNvGraphicFramePr>
+              <a:graphicFrameLocks noChangeAspect="1"/>
+            </wp:cNvGraphicFramePr>
+            <a:graphic>
+              <a:graphicData uri="http://schemas.openxmlformats.org/drawingml/2006/picture">
+                <pic:pic>
+                  <pic:nvPicPr>
+                    <pic:cNvPr id="0" name="aufbau3d_esp_S3.png"/>
+                    <pic:cNvPicPr/>
+                  </pic:nvPicPr>
+                  <pic:blipFill>
+                    <a:blip r:embed="rId16"/>
+                    <a:stretch>
+                      <a:fillRect/>
+                    </a:stretch>
+                  </pic:blipFill>
+                  <pic:spPr>
+                    <a:xfrm>
+                      <a:off x="0" y="0"/>
+                      <a:ext cx="5715000" cy="3577167"/>
+                    </a:xfrm>
+                    <a:prstGeom prst="rect"/>
+                  </pic:spPr>
+                </pic:pic>
+              </a:graphicData>
+            </a:graphic>
+          </wp:inline>
+        </w:drawing>
+      </w:r>
+    </w:p>
+    <w:p>
+      <w:pPr>
+        <w:spacing w:after="200"/>
+        <w:jc w:val="center"/>
+      </w:pPr>
+      <w:r>
+        <w:rPr>
+          <w:rFonts w:ascii="Arial" w:cs="Arial" w:eastAsia="Arial" w:hAnsi="Arial"/>
+          <w:i/>
+          <w:iCs/>
+          <w:color w:val="64748B"/>
+          <w:sz w:val="18"/>
+          <w:szCs w:val="18"/>
+        </w:rPr>
+        <w:t>Bild 6: ESP-Seite mit BOOT-Taste und den Lötpunkten von Port A (3D-Ansicht)</w:t>
+      </w:r>
+    </w:p>
+    <w:p>
+      <w:pPr>
+        <w:spacing w:after="60" w:before="120"/>
+        <w:jc w:val="center"/>
+      </w:pPr>
+      <w:r>
+        <w:drawing>
+          <wp:inline xmlns:a="http://schemas.openxmlformats.org/drawingml/2006/main" xmlns:pic="http://schemas.openxmlformats.org/drawingml/2006/picture">
+            <wp:extent cx="2340000" cy="3432763"/>
+            <wp:docPr id="3" name="Picture 3"/>
+            <wp:cNvGraphicFramePr>
+              <a:graphicFrameLocks noChangeAspect="1"/>
+            </wp:cNvGraphicFramePr>
+            <a:graphic>
+              <a:graphicData uri="http://schemas.openxmlformats.org/drawingml/2006/picture">
+                <pic:pic>
+                  <pic:nvPicPr>
+                    <pic:cNvPr id="0" name="foto_max_seite_S3.jpg"/>
+                    <pic:cNvPicPr/>
+                  </pic:nvPicPr>
+                  <pic:blipFill>
+                    <a:blip r:embed="rId17"/>
+                    <a:stretch>
+                      <a:fillRect/>
+                    </a:stretch>
+                  </pic:blipFill>
+                  <pic:spPr>
+                    <a:xfrm>
+                      <a:off x="0" y="0"/>
+                      <a:ext cx="2340000" cy="3432763"/>
+                    </a:xfrm>
+                    <a:prstGeom prst="rect"/>
+                  </pic:spPr>
+                </pic:pic>
+              </a:graphicData>
+            </a:graphic>
+          </wp:inline>
+        </w:drawing>
+      </w:r>
+      <w:r>
+        <w:t xml:space="preserve">   </w:t>
+      </w:r>
+      <w:r>
+        <w:drawing>
+          <wp:inline xmlns:a="http://schemas.openxmlformats.org/drawingml/2006/main" xmlns:pic="http://schemas.openxmlformats.org/drawingml/2006/picture">
+            <wp:extent cx="2340000" cy="1969500"/>
+            <wp:docPr id="4" name="Picture 4"/>
+            <wp:cNvGraphicFramePr>
+              <a:graphicFrameLocks noChangeAspect="1"/>
+            </wp:cNvGraphicFramePr>
+            <a:graphic>
+              <a:graphicData uri="http://schemas.openxmlformats.org/drawingml/2006/picture">
+                <pic:pic>
+                  <pic:nvPicPr>
+                    <pic:cNvPr id="0" name="foto_esp_seite_S3.jpg"/>
+                    <pic:cNvPicPr/>
+                  </pic:nvPicPr>
+                  <pic:blipFill>
+                    <a:blip r:embed="rId18"/>
+                    <a:stretch>
+                      <a:fillRect/>
+                    </a:stretch>
+                  </pic:blipFill>
+                  <pic:spPr>
+                    <a:xfrm>
+                      <a:off x="0" y="0"/>
+                      <a:ext cx="2340000" cy="1969500"/>
+                    </a:xfrm>
+                    <a:prstGeom prst="rect"/>
+                  </pic:spPr>
+                </pic:pic>
+              </a:graphicData>
+            </a:graphic>
+          </wp:inline>
+        </w:drawing>
+      </w:r>
+    </w:p>
+    <w:p>
+      <w:pPr>
+        <w:spacing w:after="200"/>
+        <w:jc w:val="center"/>
+      </w:pPr>
+      <w:r>
+        <w:rPr>
+          <w:rFonts w:ascii="Arial" w:cs="Arial" w:eastAsia="Arial" w:hAnsi="Arial"/>
+          <w:i/>
+          <w:iCs/>
+          <w:color w:val="64748B"/>
+          <w:sz w:val="18"/>
+          <w:szCs w:val="18"/>
+        </w:rPr>
+        <w:t>Bild 7: Martins Musteraufbau, links MAX-Seite, rechts ESP-Seite (Port-A-Kabel im Foto noch grün und orange)</w:t>
       </w:r>
     </w:p>
     <w:p>
@@ -4450,7 +4414,7 @@
           <w:sz w:val="22"/>
           <w:szCs w:val="22"/>
         </w:rPr>
-        <w:t xml:space="preserve">ESP-Board per USB anschließen und die Firmware flashen (siehe Abschnitt 9). Erst wenn das Board läuft, weiterbauen.</w:t>
+        <w:t>ESP-Board per USB anschließen und die Firmware flashen (siehe Abschnitt 9). Erst wenn das Board läuft, weiterbauen.</w:t>
       </w:r>
     </w:p>
     <w:p>
@@ -4470,7 +4434,7 @@
           <w:sz w:val="22"/>
           <w:szCs w:val="22"/>
         </w:rPr>
-        <w:t xml:space="preserve">Platine planen. </w:t>
+        <w:t xml:space="preserve">SD-Stift entfernen. </w:t>
       </w:r>
       <w:r>
         <w:rPr>
@@ -4478,7 +4442,7 @@
           <w:sz w:val="22"/>
           <w:szCs w:val="22"/>
         </w:rPr>
-        <w:t xml:space="preserve">Bauteile nach Bild 5 auflegen: ESP mit aufgelötetem MAX an eine Kante (USB-C zugänglich), Stecker an die gegenüberliegende Kante.</w:t>
+        <w:t>Aus der 7-poligen Stiftleiste den dritten Stift von VIN aus (SD) herausziehen oder abkneifen. So bleibt 3V3 frei.</w:t>
       </w:r>
     </w:p>
     <w:p>
@@ -4498,7 +4462,7 @@
           <w:sz w:val="22"/>
           <w:szCs w:val="22"/>
         </w:rPr>
-        <w:t xml:space="preserve">Buchsenleisten für den ESP einlöten. </w:t>
+        <w:t xml:space="preserve">MAX auf den ESP setzen. </w:t>
       </w:r>
       <w:r>
         <w:rPr>
@@ -4506,7 +4470,7 @@
           <w:sz w:val="22"/>
           <w:szCs w:val="22"/>
         </w:rPr>
-        <w:t xml:space="preserve">So bleibt das Board steckbar und lässt sich tauschen.</w:t>
+        <w:t>Die Stiftleiste von der Rückseite des ESP in die Löcher 5V bis IO4 stecken, die Kunststoffleiste liegt zwischen den Platinen. Den MAX mit der Bauteilseite nach außen aufsetzen: VIN auf 5V, GND auf GND, LRC auf IO4 (Bild 5).</w:t>
       </w:r>
     </w:p>
     <w:p>
@@ -4526,7 +4490,7 @@
           <w:sz w:val="22"/>
           <w:szCs w:val="22"/>
         </w:rPr>
-        <w:t xml:space="preserve">+5V- und GND-Schiene legen. </w:t>
+        <w:t xml:space="preserve">Stiftleiste verlöten. </w:t>
       </w:r>
       <w:r>
         <w:rPr>
@@ -4534,7 +4498,7 @@
           <w:sz w:val="22"/>
           <w:szCs w:val="22"/>
         </w:rPr>
-        <w:t xml:space="preserve">Zwei durchgehende Leitungen (Silberdraht oder dicke Litze) über die Platine.</w:t>
+        <w:t>Zuerst einen Stift auf beiden Seiten anlöten und die Lage prüfen, dann die übrigen Stifte auf der ESP-Seite und auf der MAX-Seite verlöten.</w:t>
       </w:r>
     </w:p>
     <w:p>
@@ -4554,7 +4518,7 @@
           <w:sz w:val="22"/>
           <w:szCs w:val="22"/>
         </w:rPr>
-        <w:t xml:space="preserve">Verstärker auf den ESP löten. </w:t>
+        <w:t xml:space="preserve">Port-B-Stifte einlöten. </w:t>
       </w:r>
       <w:r>
         <w:rPr>
@@ -4562,7 +4526,7 @@
           <w:sz w:val="22"/>
           <w:szCs w:val="22"/>
         </w:rPr>
-        <w:t xml:space="preserve">Den MAX98357A mit seiner 7-poligen Stiftleiste so auf die Versorgungsreihe setzen, dass VIN auf 5V und LRC auf IO4 liegt (Bild 3). Vor dem Löten prüfen: VIN auf 5V und GND auf GND. Den SD-Stift weglassen, damit 3V3 frei bleibt.</w:t>
+        <w:t>Eine 2-polige Stiftleiste in IO7 und IO8, die Stifte zeigen zur MAX-Seite. Im Musteraufbau sitzt auch in IO5 und IO6 eine 2-polige Stiftleiste, an die von der ESP-Seite die Port-A-Kabel gelötet sind.</w:t>
       </w:r>
     </w:p>
     <w:p>
@@ -4582,7 +4546,7 @@
           <w:sz w:val="22"/>
           <w:szCs w:val="22"/>
         </w:rPr>
-        <w:t xml:space="preserve">Lautsprecher-Anschluss. </w:t>
+        <w:t xml:space="preserve">Port-A-Kabel anlöten. </w:t>
       </w:r>
       <w:r>
         <w:rPr>
@@ -4590,7 +4554,7 @@
           <w:sz w:val="22"/>
           <w:szCs w:val="22"/>
         </w:rPr>
-        <w:t xml:space="preserve">Zwei Pins oder eine Schraubklemme an + und − des Verstärkers.</w:t>
+        <w:t>Auf der Bauteilseite des ESP (Bild 6): schwarz an GND, rot an 5V, gelb an IO5, weiß an IO6. Am anderen Ende ein 4-poliger JST-Stecker in der Reihenfolge des Empfängers (Bild 4).</w:t>
       </w:r>
     </w:p>
     <w:p>
@@ -4610,7 +4574,7 @@
           <w:sz w:val="22"/>
           <w:szCs w:val="22"/>
         </w:rPr>
-        <w:t xml:space="preserve">Port A (Empfänger) anschließen. </w:t>
+        <w:t xml:space="preserve">Port C bei Bedarf. </w:t>
       </w:r>
       <w:r>
         <w:rPr>
@@ -4618,7 +4582,7 @@
           <w:sz w:val="22"/>
           <w:szCs w:val="22"/>
         </w:rPr>
-        <w:t xml:space="preserve">Stecker nach Bild 4: GND, +5V, ESP-RX, ESP-TX.</w:t>
+        <w:t>IO43 (TX) und IO44 (RX) liegen unter dem MAX. Wer Port C braucht, lötet zwei Kabel auf der Bauteilseite des ESP direkt an die Pins.</w:t>
       </w:r>
     </w:p>
     <w:p>
@@ -4638,7 +4602,7 @@
           <w:sz w:val="22"/>
           <w:szCs w:val="22"/>
         </w:rPr>
-        <w:t xml:space="preserve">Port B und Port C anschließen. </w:t>
+        <w:t xml:space="preserve">Lautsprecher anschließen. </w:t>
       </w:r>
       <w:r>
         <w:rPr>
@@ -4646,7 +4610,7 @@
           <w:sz w:val="22"/>
           <w:szCs w:val="22"/>
         </w:rPr>
-        <w:t xml:space="preserve">Je eine 2-polige Stiftleiste mit RX und TX nach Bild 4.</w:t>
+        <w:t>Am 2-poligen JST-PH-Stecker des MAX (+ und −), nie an GND.</w:t>
       </w:r>
     </w:p>
     <w:p>
@@ -4674,7 +4638,7 @@
           <w:sz w:val="22"/>
           <w:szCs w:val="22"/>
         </w:rPr>
-        <w:t>Die BOOT-Taste des ESP-Boards ist die WLAN-Taste. Das Board so einbauen, dass man sie auch im Modell noch drücken kann. Eine WLAN-Brücke oder ein Jumper ist seit Firmware v0.05 nicht mehr nötig.</w:t>
+        <w:t>Die BOOT-Taste des ESP-Boards ist die WLAN-Taste. Das Modul so einbauen, dass man sie auch im Modell noch drücken kann. Eine WLAN-Brücke oder ein Jumper ist seit Firmware v0.05 nicht mehr nötig.</w:t>
       </w:r>
     </w:p>
     <w:p>
@@ -4730,7 +4694,7 @@
           <w:sz w:val="22"/>
           <w:szCs w:val="22"/>
         </w:rPr>
-        <w:t xml:space="preserve">ESP stecken, über USB starten, Konsole beobachten. Dann Lautsprecher anschließen und mit BEC starten.</w:t>
+        <w:t>Über USB starten und die Konsole beobachten. Dann Lautsprecher anschließen und mit BEC starten.</w:t>
       </w:r>
     </w:p>
     <w:p>
@@ -4911,7 +4875,7 @@
           <w:sz w:val="22"/>
           <w:szCs w:val="22"/>
         </w:rPr>
-        <w:t xml:space="preserve">Pinbelegung am echten S3-Zero prüfen (Schritt 5 im Projektplan) und dann als endgültig markieren.</w:t>
+        <w:t>Martins Sandwich-Aufbau läuft (27.10.2026). Nach dem vollständigen Hardwaretest die Pinbelegung als endgültig markieren.</w:t>
       </w:r>
     </w:p>
     <w:p>
@@ -4929,7 +4893,7 @@
           <w:sz w:val="22"/>
           <w:szCs w:val="22"/>
         </w:rPr>
-        <w:t xml:space="preserve">Schaltplan und Platine in KiCad (Ordner hardware/), wenn der Lochraster-Aufbau getestet ist.</w:t>
+        <w:t>Schaltplan in KiCad (Ordner hardware/) für den Sandwich-Aufbau.</w:t>
       </w:r>
     </w:p>
     <w:p>

</xml_diff>

<commit_message>
Doku: Port C als optionale Anloet-Variante in den 3D-Ansichten
Co-Authored-By: Claude Opus 5.5 <noreply@anthropic.com>
Claude-Session: https://claude.ai/code/session_0118D4qqy4wNMTv6qeK7BG5d
</commit_message>
<xml_diff>
--- a/docs/Hardware-Bauplan_Mini-S3.docx
+++ b/docs/Hardware-Bauplan_Mini-S3.docx
@@ -4292,7 +4292,7 @@
           <w:sz w:val="18"/>
           <w:szCs w:val="18"/>
         </w:rPr>
-        <w:t>Bild 6: ESP-Seite mit BOOT-Taste und den Lötpunkten von Port A (3D-Ansicht)</w:t>
+        <w:t>Bild 6: ESP-Seite mit BOOT-Taste, Lötpunkten von Port A und optional Port C (3D-Ansicht)</w:t>
       </w:r>
     </w:p>
     <w:p>
@@ -4582,7 +4582,7 @@
           <w:sz w:val="22"/>
           <w:szCs w:val="22"/>
         </w:rPr>
-        <w:t>IO43 (TX) und IO44 (RX) liegen unter dem MAX. Wer Port C braucht, lötet zwei Kabel auf der Bauteilseite des ESP direkt an die Pins.</w:t>
+        <w:t>IO43 (TX) und IO44 (RX) liegen unter dem MAX. Wer Port C braucht, lötet zwei Kabel auf der Bauteilseite des ESP direkt an die Pins, z. B. grün an IO43 und blau an IO44. In Bild 5 und 6 ist diese Option halb durchsichtig gezeichnet.</w:t>
       </w:r>
     </w:p>
     <w:p>

</xml_diff>

<commit_message>
Doku: DOCX repariert (eindeutige Bild-IDs), 3D-Modell als HTML
- Hardware-Bauplan: doppelte docPr-IDs der Bilder machten die Datei in Word kaputt
- Projektbeschreibung: Stand 27.10.2026, Firmware v0.06
- docs/3d-modell/Aufbau3D_Mini-S3.html: drehbares 3D-Modell
- .gitattributes: docx/png/jpg als binaer

Co-Authored-By: Claude Opus 5.5 <noreply@anthropic.com>
Claude-Session: https://claude.ai/code/session_0118D4qqy4wNMTv6qeK7BG5d
</commit_message>
<xml_diff>
--- a/docs/Hardware-Bauplan_Mini-S3.docx
+++ b/docs/Hardware-Bauplan_Mini-S3.docx
@@ -176,7 +176,7 @@
               <a:graphicData uri="http://schemas.openxmlformats.org/drawingml/2006/picture">
                 <pic:pic xmlns:pic="http://schemas.openxmlformats.org/drawingml/2006/picture">
                   <pic:nvPicPr>
-                    <pic:cNvPr id="0" name="" descr=""/>
+                    <pic:cNvPr id="1" name="" descr=""/>
                     <pic:cNvPicPr>
                       <a:picLocks noChangeAspect="1" noChangeArrowheads="1"/>
                     </pic:cNvPicPr>
@@ -3767,7 +3767,7 @@
           <wp:inline distT="0" distB="0" distL="0" distR="0">
             <wp:extent cx="7524750" cy="4305300"/>
             <wp:effectExtent t="0" r="0" b="0" l="0"/>
-            <wp:docPr id="1" name="verdrahtung_S3.png" descr="Bild 2: Verdrahtungsplan Mini S3" title="Bild 2: Verdrahtungsplan Mini S3"/>
+            <wp:docPr id="2" name="verdrahtung_S3.png" descr="Bild 2: Verdrahtungsplan Mini S3" title="Bild 2: Verdrahtungsplan Mini S3"/>
             <wp:cNvGraphicFramePr>
               <a:graphicFrameLocks xmlns:a="http://schemas.openxmlformats.org/drawingml/2006/main" noChangeAspect="1"/>
             </wp:cNvGraphicFramePr>
@@ -3775,7 +3775,7 @@
               <a:graphicData uri="http://schemas.openxmlformats.org/drawingml/2006/picture">
                 <pic:pic xmlns:pic="http://schemas.openxmlformats.org/drawingml/2006/picture">
                   <pic:nvPicPr>
-                    <pic:cNvPr id="0" name="" descr=""/>
+                    <pic:cNvPr id="2" name="" descr=""/>
                     <pic:cNvPicPr>
                       <a:picLocks noChangeAspect="1" noChangeArrowheads="1"/>
                     </pic:cNvPicPr>
@@ -3866,7 +3866,7 @@
           <wp:inline distT="0" distB="0" distL="0" distR="0">
             <wp:extent cx="5334000" cy="3286125"/>
             <wp:effectExtent t="0" r="0" b="0" l="0"/>
-            <wp:docPr id="1" name="max_direkt_S3.png" descr="Bild 3: MAX98357A direkt auf dem Waveshare ESP32-S3-Zero" title="Bild 3: MAX98357A direkt auf dem Waveshare ESP32-S3-Zero"/>
+            <wp:docPr id="3" name="max_direkt_S3.png" descr="Bild 3: MAX98357A direkt auf dem Waveshare ESP32-S3-Zero" title="Bild 3: MAX98357A direkt auf dem Waveshare ESP32-S3-Zero"/>
             <wp:cNvGraphicFramePr>
               <a:graphicFrameLocks xmlns:a="http://schemas.openxmlformats.org/drawingml/2006/main" noChangeAspect="1"/>
             </wp:cNvGraphicFramePr>
@@ -3874,7 +3874,7 @@
               <a:graphicData uri="http://schemas.openxmlformats.org/drawingml/2006/picture">
                 <pic:pic xmlns:pic="http://schemas.openxmlformats.org/drawingml/2006/picture">
                   <pic:nvPicPr>
-                    <pic:cNvPr id="0" name="" descr=""/>
+                    <pic:cNvPr id="3" name="" descr=""/>
                     <pic:cNvPicPr>
                       <a:picLocks noChangeAspect="1" noChangeArrowheads="1"/>
                     </pic:cNvPicPr>
@@ -4026,7 +4026,7 @@
           <wp:inline distT="0" distB="0" distL="0" distR="0">
             <wp:extent cx="5905500" cy="2362200"/>
             <wp:effectExtent t="0" r="0" b="0" l="0"/>
-            <wp:docPr id="1" name="stecker_S3.png" descr="Bild 4: Steckerbelegung Port A, B und C" title="Bild 4: Steckerbelegung Port A, B und C"/>
+            <wp:docPr id="4" name="stecker_S3.png" descr="Bild 4: Steckerbelegung Port A, B und C" title="Bild 4: Steckerbelegung Port A, B und C"/>
             <wp:cNvGraphicFramePr>
               <a:graphicFrameLocks xmlns:a="http://schemas.openxmlformats.org/drawingml/2006/main" noChangeAspect="1"/>
             </wp:cNvGraphicFramePr>
@@ -4034,7 +4034,7 @@
               <a:graphicData uri="http://schemas.openxmlformats.org/drawingml/2006/picture">
                 <pic:pic xmlns:pic="http://schemas.openxmlformats.org/drawingml/2006/picture">
                   <pic:nvPicPr>
-                    <pic:cNvPr id="0" name="" descr=""/>
+                    <pic:cNvPr id="4" name="" descr=""/>
                     <pic:cNvPicPr>
                       <a:picLocks noChangeAspect="1" noChangeArrowheads="1"/>
                     </pic:cNvPicPr>
@@ -4185,7 +4185,7 @@
           <wp:inline distT="0" distB="0" distL="0" distR="0">
             <wp:extent cx="5715000" cy="3577166"/>
             <wp:effectExtent t="0" r="0" b="0" l="0"/>
-            <wp:docPr id="1" name="aufbau3d_max_S3.png" descr="Bild 5: Aufbau als Sandwich, MAX-Seite" title="Bild 5: Aufbau als Sandwich, MAX-Seite"/>
+            <wp:docPr id="5" name="aufbau3d_max_S3.png" descr="Bild 5: Aufbau als Sandwich, MAX-Seite" title="Bild 5: Aufbau als Sandwich, MAX-Seite"/>
             <wp:cNvGraphicFramePr>
               <a:graphicFrameLocks xmlns:a="http://schemas.openxmlformats.org/drawingml/2006/main" noChangeAspect="1"/>
             </wp:cNvGraphicFramePr>
@@ -4193,7 +4193,7 @@
               <a:graphicData uri="http://schemas.openxmlformats.org/drawingml/2006/picture">
                 <pic:pic xmlns:pic="http://schemas.openxmlformats.org/drawingml/2006/picture">
                   <pic:nvPicPr>
-                    <pic:cNvPr id="0" name="" descr=""/>
+                    <pic:cNvPr id="5" name="" descr=""/>
                     <pic:cNvPicPr>
                       <a:picLocks noChangeAspect="1" noChangeArrowheads="1"/>
                     </pic:cNvPicPr>
@@ -4247,7 +4247,7 @@
         <w:drawing>
           <wp:inline xmlns:a="http://schemas.openxmlformats.org/drawingml/2006/main" xmlns:pic="http://schemas.openxmlformats.org/drawingml/2006/picture">
             <wp:extent cx="5715000" cy="3577167"/>
-            <wp:docPr id="2" name="Picture 2"/>
+            <wp:docPr id="6" name="Picture 2"/>
             <wp:cNvGraphicFramePr>
               <a:graphicFrameLocks noChangeAspect="1"/>
             </wp:cNvGraphicFramePr>
@@ -4255,7 +4255,7 @@
               <a:graphicData uri="http://schemas.openxmlformats.org/drawingml/2006/picture">
                 <pic:pic>
                   <pic:nvPicPr>
-                    <pic:cNvPr id="0" name="aufbau3d_esp_S3.png"/>
+                    <pic:cNvPr id="6" name="aufbau3d_esp_S3.png"/>
                     <pic:cNvPicPr/>
                   </pic:nvPicPr>
                   <pic:blipFill>
@@ -4304,7 +4304,7 @@
         <w:drawing>
           <wp:inline xmlns:a="http://schemas.openxmlformats.org/drawingml/2006/main" xmlns:pic="http://schemas.openxmlformats.org/drawingml/2006/picture">
             <wp:extent cx="2340000" cy="3432763"/>
-            <wp:docPr id="3" name="Picture 3"/>
+            <wp:docPr id="7" name="Picture 3"/>
             <wp:cNvGraphicFramePr>
               <a:graphicFrameLocks noChangeAspect="1"/>
             </wp:cNvGraphicFramePr>
@@ -4312,7 +4312,7 @@
               <a:graphicData uri="http://schemas.openxmlformats.org/drawingml/2006/picture">
                 <pic:pic>
                   <pic:nvPicPr>
-                    <pic:cNvPr id="0" name="foto_max_seite_S3.jpg"/>
+                    <pic:cNvPr id="7" name="foto_max_seite_S3.jpg"/>
                     <pic:cNvPicPr/>
                   </pic:nvPicPr>
                   <pic:blipFill>
@@ -4341,7 +4341,7 @@
         <w:drawing>
           <wp:inline xmlns:a="http://schemas.openxmlformats.org/drawingml/2006/main" xmlns:pic="http://schemas.openxmlformats.org/drawingml/2006/picture">
             <wp:extent cx="2340000" cy="1969500"/>
-            <wp:docPr id="4" name="Picture 4"/>
+            <wp:docPr id="8" name="Picture 4"/>
             <wp:cNvGraphicFramePr>
               <a:graphicFrameLocks noChangeAspect="1"/>
             </wp:cNvGraphicFramePr>
@@ -4349,7 +4349,7 @@
               <a:graphicData uri="http://schemas.openxmlformats.org/drawingml/2006/picture">
                 <pic:pic>
                   <pic:nvPicPr>
-                    <pic:cNvPr id="0" name="foto_esp_seite_S3.jpg"/>
+                    <pic:cNvPr id="8" name="foto_esp_seite_S3.jpg"/>
                     <pic:cNvPicPr/>
                   </pic:nvPicPr>
                   <pic:blipFill>

</xml_diff>

<commit_message>
Doku: Firmware v0.06 als auf Hardware getestet
README, Projektbeschreibung und Hardware-Bauplan auf Stand 28.10.2026.
Projektbeschreibung ergänzt um die Speicherbelegung (v0.06), Versionszeile
0.06, Projektstruktur Arduino-Skizze, nächste Schritte aktualisiert.

Co-Authored-By: Claude Opus 5.5 <noreply@anthropic.com>
Claude-Session: https://claude.ai/code/session_0118D4qtyVZjdZJdvELZ2F6M
</commit_message>
<xml_diff>
--- a/docs/Hardware-Bauplan_Mini-S3.docx
+++ b/docs/Hardware-Bauplan_Mini-S3.docx
@@ -43,7 +43,7 @@
           <w:sz w:val="20"/>
           <w:szCs w:val="20"/>
         </w:rPr>
-        <w:t>Waveshare ESP32-S3-Zero · ESP32-S3FH4R2 (4 MB Flash, 2 MB PSRAM) · Stand 27.10.2026 (Firmware v0.06) · Aufbau nach Martins Muster</w:t>
+        <w:t>Waveshare ESP32-S3-Zero · ESP32-S3FH4R2 (4 MB Flash, 2 MB PSRAM) · Stand 28.10.2026 (Firmware v0.06, getestet) · Aufbau nach Martins Muster</w:t>
       </w:r>
     </w:p>
     <w:tbl>
@@ -4875,7 +4875,7 @@
           <w:sz w:val="22"/>
           <w:szCs w:val="22"/>
         </w:rPr>
-        <w:t>Martins Sandwich-Aufbau läuft (27.10.2026). Nach dem vollständigen Hardwaretest die Pinbelegung als endgültig markieren.</w:t>
+        <w:t>Martins Sandwich-Aufbau läuft mit Firmware v0.06, Hardwaretest bestanden (28.10.2026). Als Nächstes die Pinbelegung als endgültig markieren.</w:t>
       </w:r>
     </w:p>
     <w:p>
@@ -4929,7 +4929,7 @@
           <w:sz w:val="22"/>
           <w:szCs w:val="22"/>
         </w:rPr>
-        <w:t xml:space="preserve">Hardwaretest durch Martin, danach Version 1.00.</w:t>
+        <w:t>Danach Version 1.00.</w:t>
       </w:r>
     </w:p>
     <w:sectPr>

</xml_diff>